<commit_message>
embed 4 matplotlib figures into Word document matching PDF diagrams
- Add generate_figures.py: recreates all 4 TikZ diagrams using matplotlib
  * fig_gap: two-column comparison (existing SLM methods vs. cold-start approach)
  * fig_pipeline: three-cycle flowchart with Bootstrap loop
  * fig_arch: Planner + MCP layer + specialist SLM architecture
  * fig_gantt: 4-milestone 12-month Gantt chart with diamond markers
  Uses Noto Sans CJK JP + DejaVu Sans fallback for Chinese + math symbols

- Update make_docx.py:
  * Auto-invoke generate_figures.py on first run
  * Add insert_figure() helper for centered image + italic caption
  * Insert fig_gap after cold-start section (section 1.2)
  * Insert fig_pipeline after 三循环训练流程 heading (section 1.4)
  * Insert fig_arch after Planner architecture description (section 1.4)
  * Replace ASCII gantt table with fig_gantt PNG (section 2.2)

https://claude.ai/code/session_01CfEBbsY5jpjYVp54ggWYif
</commit_message>
<xml_diff>
--- a/申请书_阿里巴巴AI研究资助计划2026.docx
+++ b/申请书_阿里巴巴AI研究资助计划2026.docx
@@ -486,6 +486,60 @@
     </w:p>
     <w:p>
       <w:pPr>
+        <w:jc w:val="center"/>
+        <w:spacing w:line="240" w:lineRule="auto" w:after="40"/>
+      </w:pPr>
+      <w:r>
+        <w:drawing>
+          <wp:inline xmlns:a="http://schemas.openxmlformats.org/drawingml/2006/main" xmlns:pic="http://schemas.openxmlformats.org/drawingml/2006/picture">
+            <wp:extent cx="4860000" cy="2493668"/>
+            <wp:docPr id="1" name="Picture 1"/>
+            <wp:cNvGraphicFramePr>
+              <a:graphicFrameLocks noChangeAspect="1"/>
+            </wp:cNvGraphicFramePr>
+            <a:graphic>
+              <a:graphicData uri="http://schemas.openxmlformats.org/drawingml/2006/picture">
+                <pic:pic>
+                  <pic:nvPicPr>
+                    <pic:cNvPr id="0" name="fig_gap.png"/>
+                    <pic:cNvPicPr/>
+                  </pic:nvPicPr>
+                  <pic:blipFill>
+                    <a:blip r:embed="rId11"/>
+                    <a:stretch>
+                      <a:fillRect/>
+                    </a:stretch>
+                  </pic:blipFill>
+                  <pic:spPr>
+                    <a:xfrm>
+                      <a:off x="0" y="0"/>
+                      <a:ext cx="4860000" cy="2493668"/>
+                    </a:xfrm>
+                    <a:prstGeom prst="rect"/>
+                  </pic:spPr>
+                </pic:pic>
+              </a:graphicData>
+            </a:graphic>
+          </wp:inline>
+        </w:drawing>
+      </w:r>
+    </w:p>
+    <w:p>
+      <w:pPr>
+        <w:jc w:val="center"/>
+        <w:spacing w:line="276" w:lineRule="auto" w:after="200"/>
+      </w:pPr>
+      <w:r>
+        <w:rPr>
+          <w:rFonts w:ascii="宋体" w:hAnsi="宋体" w:eastAsia="宋体"/>
+          <w:i/>
+          <w:sz w:val="18"/>
+        </w:rPr>
+        <w:t>图1  现有 SLM 生产方法在冷启动场景下失效（左）；本方案以历史记录中已有的标准答案作为自动验证器，绕过这一瓶颈（右）。</w:t>
+      </w:r>
+    </w:p>
+    <w:p>
+      <w:pPr>
         <w:spacing w:line="276" w:lineRule="auto" w:after="120"/>
       </w:pPr>
       <w:r>
@@ -743,6 +797,60 @@
     </w:p>
     <w:p>
       <w:pPr>
+        <w:jc w:val="center"/>
+        <w:spacing w:line="240" w:lineRule="auto" w:after="40"/>
+      </w:pPr>
+      <w:r>
+        <w:drawing>
+          <wp:inline xmlns:a="http://schemas.openxmlformats.org/drawingml/2006/main" xmlns:pic="http://schemas.openxmlformats.org/drawingml/2006/picture">
+            <wp:extent cx="4860000" cy="1688571"/>
+            <wp:docPr id="2" name="Picture 2"/>
+            <wp:cNvGraphicFramePr>
+              <a:graphicFrameLocks noChangeAspect="1"/>
+            </wp:cNvGraphicFramePr>
+            <a:graphic>
+              <a:graphicData uri="http://schemas.openxmlformats.org/drawingml/2006/picture">
+                <pic:pic>
+                  <pic:nvPicPr>
+                    <pic:cNvPr id="0" name="fig_pipeline.png"/>
+                    <pic:cNvPicPr/>
+                  </pic:nvPicPr>
+                  <pic:blipFill>
+                    <a:blip r:embed="rId12"/>
+                    <a:stretch>
+                      <a:fillRect/>
+                    </a:stretch>
+                  </pic:blipFill>
+                  <pic:spPr>
+                    <a:xfrm>
+                      <a:off x="0" y="0"/>
+                      <a:ext cx="4860000" cy="1688571"/>
+                    </a:xfrm>
+                    <a:prstGeom prst="rect"/>
+                  </pic:spPr>
+                </pic:pic>
+              </a:graphicData>
+            </a:graphic>
+          </wp:inline>
+        </w:drawing>
+      </w:r>
+    </w:p>
+    <w:p>
+      <w:pPr>
+        <w:jc w:val="center"/>
+        <w:spacing w:line="276" w:lineRule="auto" w:after="200"/>
+      </w:pPr>
+      <w:r>
+        <w:rPr>
+          <w:rFonts w:ascii="宋体" w:hAnsi="宋体" w:eastAsia="宋体"/>
+          <w:i/>
+          <w:sz w:val="18"/>
+        </w:rPr>
+        <w:t>图2  三循环迭代流水线：Cycle 1 产出验证数据集，Cycle 2 SFT 得到初始 SLM，Cycle 3 策略优化强化推理质量，Bootstrap 回路驱动数据与模型协同进化。</w:t>
+      </w:r>
+    </w:p>
+    <w:p>
+      <w:pPr>
         <w:spacing w:line="276" w:lineRule="auto" w:after="120"/>
       </w:pPr>
       <w:r>
@@ -951,6 +1059,60 @@
         <w:t>云端 LLM（72B 或同等模型）充当 Planner，将故障事件分解为子任务并路由至对应的专家小智能体（SLM）；每个小智能体专为单一 AIOps 子场景训练（如数据库慢查询诊断、网络分区检测、容器 OOM 分诊），本地推理延迟 &lt;100ms。</w:t>
         <w:br/>
         <w:t>Planner–专家小智能体分层设计同时保留了大模型的全局语义广度与小模型的窄域推理深度，端到端系统可在秒级内响应高频告警。</w:t>
+      </w:r>
+    </w:p>
+    <w:p>
+      <w:pPr>
+        <w:jc w:val="center"/>
+        <w:spacing w:line="240" w:lineRule="auto" w:after="40"/>
+      </w:pPr>
+      <w:r>
+        <w:drawing>
+          <wp:inline xmlns:a="http://schemas.openxmlformats.org/drawingml/2006/main" xmlns:pic="http://schemas.openxmlformats.org/drawingml/2006/picture">
+            <wp:extent cx="4860000" cy="2596611"/>
+            <wp:docPr id="3" name="Picture 3"/>
+            <wp:cNvGraphicFramePr>
+              <a:graphicFrameLocks noChangeAspect="1"/>
+            </wp:cNvGraphicFramePr>
+            <a:graphic>
+              <a:graphicData uri="http://schemas.openxmlformats.org/drawingml/2006/picture">
+                <pic:pic>
+                  <pic:nvPicPr>
+                    <pic:cNvPr id="0" name="fig_arch.png"/>
+                    <pic:cNvPicPr/>
+                  </pic:nvPicPr>
+                  <pic:blipFill>
+                    <a:blip r:embed="rId13"/>
+                    <a:stretch>
+                      <a:fillRect/>
+                    </a:stretch>
+                  </pic:blipFill>
+                  <pic:spPr>
+                    <a:xfrm>
+                      <a:off x="0" y="0"/>
+                      <a:ext cx="4860000" cy="2596611"/>
+                    </a:xfrm>
+                    <a:prstGeom prst="rect"/>
+                  </pic:spPr>
+                </pic:pic>
+              </a:graphicData>
+            </a:graphic>
+          </wp:inline>
+        </w:drawing>
+      </w:r>
+    </w:p>
+    <w:p>
+      <w:pPr>
+        <w:jc w:val="center"/>
+        <w:spacing w:line="276" w:lineRule="auto" w:after="200"/>
+      </w:pPr>
+      <w:r>
+        <w:rPr>
+          <w:rFonts w:ascii="宋体" w:hAnsi="宋体" w:eastAsia="宋体"/>
+          <w:i/>
+          <w:sz w:val="18"/>
+        </w:rPr>
+        <w:t>图3  系统架构：云端 LLM Planner 分解故障事件，调度由三循环流水线离线生产的专家小智能体（SLM）高效执行各子任务。</w:t>
       </w:r>
     </w:p>
     <w:p>
@@ -1531,1609 +1693,60 @@
         </w:tc>
       </w:tr>
     </w:tbl>
-    <w:p/>
     <w:p>
       <w:pPr>
-        <w:spacing w:line="276" w:lineRule="auto" w:after="120"/>
+        <w:jc w:val="center"/>
+        <w:spacing w:line="240" w:lineRule="auto" w:after="40"/>
+      </w:pPr>
+      <w:r>
+        <w:drawing>
+          <wp:inline xmlns:a="http://schemas.openxmlformats.org/drawingml/2006/main" xmlns:pic="http://schemas.openxmlformats.org/drawingml/2006/picture">
+            <wp:extent cx="4860000" cy="1750196"/>
+            <wp:docPr id="4" name="Picture 4"/>
+            <wp:cNvGraphicFramePr>
+              <a:graphicFrameLocks noChangeAspect="1"/>
+            </wp:cNvGraphicFramePr>
+            <a:graphic>
+              <a:graphicData uri="http://schemas.openxmlformats.org/drawingml/2006/picture">
+                <pic:pic>
+                  <pic:nvPicPr>
+                    <pic:cNvPr id="0" name="fig_gantt.png"/>
+                    <pic:cNvPicPr/>
+                  </pic:nvPicPr>
+                  <pic:blipFill>
+                    <a:blip r:embed="rId14"/>
+                    <a:stretch>
+                      <a:fillRect/>
+                    </a:stretch>
+                  </pic:blipFill>
+                  <pic:spPr>
+                    <a:xfrm>
+                      <a:off x="0" y="0"/>
+                      <a:ext cx="4860000" cy="1750196"/>
+                    </a:xfrm>
+                    <a:prstGeom prst="rect"/>
+                  </pic:spPr>
+                </pic:pic>
+              </a:graphicData>
+            </a:graphic>
+          </wp:inline>
+        </w:drawing>
+      </w:r>
+    </w:p>
+    <w:p>
+      <w:pPr>
+        <w:jc w:val="center"/>
+        <w:spacing w:line="276" w:lineRule="auto" w:after="200"/>
       </w:pPr>
       <w:r>
         <w:rPr>
           <w:rFonts w:ascii="宋体" w:hAnsi="宋体" w:eastAsia="宋体"/>
-          <w:sz w:val="22"/>
+          <w:i/>
+          <w:sz w:val="18"/>
         </w:rPr>
-        <w:t>图1  项目甘特图（四个里程碑）。</w:t>
+        <w:t>图4  项目甘特图（四个里程碑）。</w:t>
       </w:r>
     </w:p>
-    <w:tbl>
-      <w:tblPr>
-        <w:tblStyle w:val="TableGrid"/>
-        <w:jc w:val="center"/>
-        <w:tblLook w:firstColumn="1" w:firstRow="1" w:lastColumn="0" w:lastRow="0" w:noHBand="0" w:noVBand="1" w:val="04A0"/>
-        <w:tblW w:w="8164" w:type="dxa"/>
-      </w:tblPr>
-      <w:tblGrid>
-        <w:gridCol w:w="672"/>
-        <w:gridCol w:w="672"/>
-        <w:gridCol w:w="672"/>
-        <w:gridCol w:w="672"/>
-        <w:gridCol w:w="672"/>
-        <w:gridCol w:w="672"/>
-        <w:gridCol w:w="672"/>
-        <w:gridCol w:w="672"/>
-        <w:gridCol w:w="672"/>
-        <w:gridCol w:w="672"/>
-        <w:gridCol w:w="672"/>
-        <w:gridCol w:w="672"/>
-        <w:gridCol w:w="672"/>
-      </w:tblGrid>
-      <w:tr>
-        <w:tc>
-          <w:tcPr>
-            <w:tcW w:type="dxa" w:w="3061"/>
-            <w:tcMar>
-              <w:top w:w="40" w:type="dxa"/>
-              <w:start w:w="60" w:type="dxa"/>
-              <w:bottom w:w="40" w:type="dxa"/>
-              <w:end w:w="60" w:type="dxa"/>
-            </w:tcMar>
-            <w:shd w:val="clear" w:color="auto" w:fill="D4D4D4"/>
-          </w:tcPr>
-          <w:p>
-            <w:pPr>
-              <w:spacing w:line="276" w:lineRule="auto" w:after="0"/>
-            </w:pPr>
-            <w:r>
-              <w:rPr>
-                <w:rFonts w:ascii="黑体" w:hAnsi="黑体" w:eastAsia="黑体"/>
-                <w:b/>
-                <w:sz w:val="18"/>
-              </w:rPr>
-              <w:t>任务</w:t>
-            </w:r>
-          </w:p>
-        </w:tc>
-        <w:tc>
-          <w:tcPr>
-            <w:tcW w:type="dxa" w:w="425"/>
-            <w:tcMar>
-              <w:top w:w="40" w:type="dxa"/>
-              <w:start w:w="60" w:type="dxa"/>
-              <w:bottom w:w="40" w:type="dxa"/>
-              <w:end w:w="60" w:type="dxa"/>
-            </w:tcMar>
-            <w:shd w:val="clear" w:color="auto" w:fill="D4D4D4"/>
-          </w:tcPr>
-          <w:p>
-            <w:pPr>
-              <w:jc w:val="center"/>
-              <w:spacing w:line="276" w:lineRule="auto" w:after="0"/>
-            </w:pPr>
-            <w:r>
-              <w:rPr>
-                <w:rFonts w:ascii="黑体" w:hAnsi="黑体" w:eastAsia="黑体"/>
-                <w:b/>
-                <w:sz w:val="18"/>
-              </w:rPr>
-              <w:t>1</w:t>
-            </w:r>
-          </w:p>
-        </w:tc>
-        <w:tc>
-          <w:tcPr>
-            <w:tcW w:type="dxa" w:w="425"/>
-            <w:tcMar>
-              <w:top w:w="40" w:type="dxa"/>
-              <w:start w:w="60" w:type="dxa"/>
-              <w:bottom w:w="40" w:type="dxa"/>
-              <w:end w:w="60" w:type="dxa"/>
-            </w:tcMar>
-            <w:shd w:val="clear" w:color="auto" w:fill="D4D4D4"/>
-          </w:tcPr>
-          <w:p>
-            <w:pPr>
-              <w:jc w:val="center"/>
-              <w:spacing w:line="276" w:lineRule="auto" w:after="0"/>
-            </w:pPr>
-            <w:r>
-              <w:rPr>
-                <w:rFonts w:ascii="黑体" w:hAnsi="黑体" w:eastAsia="黑体"/>
-                <w:b/>
-                <w:sz w:val="18"/>
-              </w:rPr>
-              <w:t>2</w:t>
-            </w:r>
-          </w:p>
-        </w:tc>
-        <w:tc>
-          <w:tcPr>
-            <w:tcW w:type="dxa" w:w="425"/>
-            <w:tcMar>
-              <w:top w:w="40" w:type="dxa"/>
-              <w:start w:w="60" w:type="dxa"/>
-              <w:bottom w:w="40" w:type="dxa"/>
-              <w:end w:w="60" w:type="dxa"/>
-            </w:tcMar>
-            <w:shd w:val="clear" w:color="auto" w:fill="D4D4D4"/>
-          </w:tcPr>
-          <w:p>
-            <w:pPr>
-              <w:jc w:val="center"/>
-              <w:spacing w:line="276" w:lineRule="auto" w:after="0"/>
-            </w:pPr>
-            <w:r>
-              <w:rPr>
-                <w:rFonts w:ascii="黑体" w:hAnsi="黑体" w:eastAsia="黑体"/>
-                <w:b/>
-                <w:sz w:val="18"/>
-              </w:rPr>
-              <w:t>3</w:t>
-            </w:r>
-          </w:p>
-        </w:tc>
-        <w:tc>
-          <w:tcPr>
-            <w:tcW w:type="dxa" w:w="425"/>
-            <w:tcMar>
-              <w:top w:w="40" w:type="dxa"/>
-              <w:start w:w="60" w:type="dxa"/>
-              <w:bottom w:w="40" w:type="dxa"/>
-              <w:end w:w="60" w:type="dxa"/>
-            </w:tcMar>
-            <w:shd w:val="clear" w:color="auto" w:fill="D4D4D4"/>
-          </w:tcPr>
-          <w:p>
-            <w:pPr>
-              <w:jc w:val="center"/>
-              <w:spacing w:line="276" w:lineRule="auto" w:after="0"/>
-            </w:pPr>
-            <w:r>
-              <w:rPr>
-                <w:rFonts w:ascii="黑体" w:hAnsi="黑体" w:eastAsia="黑体"/>
-                <w:b/>
-                <w:sz w:val="18"/>
-              </w:rPr>
-              <w:t>4</w:t>
-            </w:r>
-          </w:p>
-        </w:tc>
-        <w:tc>
-          <w:tcPr>
-            <w:tcW w:type="dxa" w:w="425"/>
-            <w:tcMar>
-              <w:top w:w="40" w:type="dxa"/>
-              <w:start w:w="60" w:type="dxa"/>
-              <w:bottom w:w="40" w:type="dxa"/>
-              <w:end w:w="60" w:type="dxa"/>
-            </w:tcMar>
-            <w:shd w:val="clear" w:color="auto" w:fill="D4D4D4"/>
-          </w:tcPr>
-          <w:p>
-            <w:pPr>
-              <w:jc w:val="center"/>
-              <w:spacing w:line="276" w:lineRule="auto" w:after="0"/>
-            </w:pPr>
-            <w:r>
-              <w:rPr>
-                <w:rFonts w:ascii="黑体" w:hAnsi="黑体" w:eastAsia="黑体"/>
-                <w:b/>
-                <w:sz w:val="18"/>
-              </w:rPr>
-              <w:t>5</w:t>
-            </w:r>
-          </w:p>
-        </w:tc>
-        <w:tc>
-          <w:tcPr>
-            <w:tcW w:type="dxa" w:w="425"/>
-            <w:tcMar>
-              <w:top w:w="40" w:type="dxa"/>
-              <w:start w:w="60" w:type="dxa"/>
-              <w:bottom w:w="40" w:type="dxa"/>
-              <w:end w:w="60" w:type="dxa"/>
-            </w:tcMar>
-            <w:shd w:val="clear" w:color="auto" w:fill="D4D4D4"/>
-          </w:tcPr>
-          <w:p>
-            <w:pPr>
-              <w:jc w:val="center"/>
-              <w:spacing w:line="276" w:lineRule="auto" w:after="0"/>
-            </w:pPr>
-            <w:r>
-              <w:rPr>
-                <w:rFonts w:ascii="黑体" w:hAnsi="黑体" w:eastAsia="黑体"/>
-                <w:b/>
-                <w:sz w:val="18"/>
-              </w:rPr>
-              <w:t>6</w:t>
-            </w:r>
-          </w:p>
-        </w:tc>
-        <w:tc>
-          <w:tcPr>
-            <w:tcW w:type="dxa" w:w="425"/>
-            <w:tcMar>
-              <w:top w:w="40" w:type="dxa"/>
-              <w:start w:w="60" w:type="dxa"/>
-              <w:bottom w:w="40" w:type="dxa"/>
-              <w:end w:w="60" w:type="dxa"/>
-            </w:tcMar>
-            <w:shd w:val="clear" w:color="auto" w:fill="D4D4D4"/>
-          </w:tcPr>
-          <w:p>
-            <w:pPr>
-              <w:jc w:val="center"/>
-              <w:spacing w:line="276" w:lineRule="auto" w:after="0"/>
-            </w:pPr>
-            <w:r>
-              <w:rPr>
-                <w:rFonts w:ascii="黑体" w:hAnsi="黑体" w:eastAsia="黑体"/>
-                <w:b/>
-                <w:sz w:val="18"/>
-              </w:rPr>
-              <w:t>7</w:t>
-            </w:r>
-          </w:p>
-        </w:tc>
-        <w:tc>
-          <w:tcPr>
-            <w:tcW w:type="dxa" w:w="425"/>
-            <w:tcMar>
-              <w:top w:w="40" w:type="dxa"/>
-              <w:start w:w="60" w:type="dxa"/>
-              <w:bottom w:w="40" w:type="dxa"/>
-              <w:end w:w="60" w:type="dxa"/>
-            </w:tcMar>
-            <w:shd w:val="clear" w:color="auto" w:fill="D4D4D4"/>
-          </w:tcPr>
-          <w:p>
-            <w:pPr>
-              <w:jc w:val="center"/>
-              <w:spacing w:line="276" w:lineRule="auto" w:after="0"/>
-            </w:pPr>
-            <w:r>
-              <w:rPr>
-                <w:rFonts w:ascii="黑体" w:hAnsi="黑体" w:eastAsia="黑体"/>
-                <w:b/>
-                <w:sz w:val="18"/>
-              </w:rPr>
-              <w:t>8</w:t>
-            </w:r>
-          </w:p>
-        </w:tc>
-        <w:tc>
-          <w:tcPr>
-            <w:tcW w:type="dxa" w:w="425"/>
-            <w:tcMar>
-              <w:top w:w="40" w:type="dxa"/>
-              <w:start w:w="60" w:type="dxa"/>
-              <w:bottom w:w="40" w:type="dxa"/>
-              <w:end w:w="60" w:type="dxa"/>
-            </w:tcMar>
-            <w:shd w:val="clear" w:color="auto" w:fill="D4D4D4"/>
-          </w:tcPr>
-          <w:p>
-            <w:pPr>
-              <w:jc w:val="center"/>
-              <w:spacing w:line="276" w:lineRule="auto" w:after="0"/>
-            </w:pPr>
-            <w:r>
-              <w:rPr>
-                <w:rFonts w:ascii="黑体" w:hAnsi="黑体" w:eastAsia="黑体"/>
-                <w:b/>
-                <w:sz w:val="18"/>
-              </w:rPr>
-              <w:t>9</w:t>
-            </w:r>
-          </w:p>
-        </w:tc>
-        <w:tc>
-          <w:tcPr>
-            <w:tcW w:type="dxa" w:w="425"/>
-            <w:tcMar>
-              <w:top w:w="40" w:type="dxa"/>
-              <w:start w:w="60" w:type="dxa"/>
-              <w:bottom w:w="40" w:type="dxa"/>
-              <w:end w:w="60" w:type="dxa"/>
-            </w:tcMar>
-            <w:shd w:val="clear" w:color="auto" w:fill="D4D4D4"/>
-          </w:tcPr>
-          <w:p>
-            <w:pPr>
-              <w:jc w:val="center"/>
-              <w:spacing w:line="276" w:lineRule="auto" w:after="0"/>
-            </w:pPr>
-            <w:r>
-              <w:rPr>
-                <w:rFonts w:ascii="黑体" w:hAnsi="黑体" w:eastAsia="黑体"/>
-                <w:b/>
-                <w:sz w:val="18"/>
-              </w:rPr>
-              <w:t>10</w:t>
-            </w:r>
-          </w:p>
-        </w:tc>
-        <w:tc>
-          <w:tcPr>
-            <w:tcW w:type="dxa" w:w="425"/>
-            <w:tcMar>
-              <w:top w:w="40" w:type="dxa"/>
-              <w:start w:w="60" w:type="dxa"/>
-              <w:bottom w:w="40" w:type="dxa"/>
-              <w:end w:w="60" w:type="dxa"/>
-            </w:tcMar>
-            <w:shd w:val="clear" w:color="auto" w:fill="D4D4D4"/>
-          </w:tcPr>
-          <w:p>
-            <w:pPr>
-              <w:jc w:val="center"/>
-              <w:spacing w:line="276" w:lineRule="auto" w:after="0"/>
-            </w:pPr>
-            <w:r>
-              <w:rPr>
-                <w:rFonts w:ascii="黑体" w:hAnsi="黑体" w:eastAsia="黑体"/>
-                <w:b/>
-                <w:sz w:val="18"/>
-              </w:rPr>
-              <w:t>11</w:t>
-            </w:r>
-          </w:p>
-        </w:tc>
-        <w:tc>
-          <w:tcPr>
-            <w:tcW w:type="dxa" w:w="425"/>
-            <w:tcMar>
-              <w:top w:w="40" w:type="dxa"/>
-              <w:start w:w="60" w:type="dxa"/>
-              <w:bottom w:w="40" w:type="dxa"/>
-              <w:end w:w="60" w:type="dxa"/>
-            </w:tcMar>
-            <w:shd w:val="clear" w:color="auto" w:fill="D4D4D4"/>
-          </w:tcPr>
-          <w:p>
-            <w:pPr>
-              <w:jc w:val="center"/>
-              <w:spacing w:line="276" w:lineRule="auto" w:after="0"/>
-            </w:pPr>
-            <w:r>
-              <w:rPr>
-                <w:rFonts w:ascii="黑体" w:hAnsi="黑体" w:eastAsia="黑体"/>
-                <w:b/>
-                <w:sz w:val="18"/>
-              </w:rPr>
-              <w:t>12</w:t>
-            </w:r>
-          </w:p>
-        </w:tc>
-      </w:tr>
-      <w:tr>
-        <w:tc>
-          <w:tcPr>
-            <w:tcW w:type="dxa" w:w="3061"/>
-            <w:tcMar>
-              <w:top w:w="40" w:type="dxa"/>
-              <w:start w:w="60" w:type="dxa"/>
-              <w:bottom w:w="40" w:type="dxa"/>
-              <w:end w:w="60" w:type="dxa"/>
-            </w:tcMar>
-          </w:tcPr>
-          <w:p>
-            <w:pPr>
-              <w:spacing w:line="276" w:lineRule="auto" w:after="0"/>
-            </w:pPr>
-            <w:r>
-              <w:rPr>
-                <w:rFonts w:ascii="宋体" w:hAnsi="宋体" w:eastAsia="宋体"/>
-                <w:sz w:val="18"/>
-              </w:rPr>
-              <w:t>M1 流水线设计与数据准备</w:t>
-            </w:r>
-          </w:p>
-        </w:tc>
-        <w:tc>
-          <w:tcPr>
-            <w:tcW w:type="dxa" w:w="425"/>
-            <w:tcMar>
-              <w:top w:w="40" w:type="dxa"/>
-              <w:start w:w="60" w:type="dxa"/>
-              <w:bottom w:w="40" w:type="dxa"/>
-              <w:end w:w="60" w:type="dxa"/>
-            </w:tcMar>
-            <w:shd w:val="clear" w:color="auto" w:fill="A0A0A0"/>
-          </w:tcPr>
-          <w:p>
-            <w:pPr>
-              <w:jc w:val="center"/>
-              <w:spacing w:line="276" w:lineRule="auto" w:after="0"/>
-            </w:pPr>
-            <w:r>
-              <w:rPr>
-                <w:rFonts w:ascii="宋体" w:hAnsi="宋体" w:eastAsia="宋体"/>
-                <w:sz w:val="18"/>
-              </w:rPr>
-              <w:t>█</w:t>
-            </w:r>
-          </w:p>
-        </w:tc>
-        <w:tc>
-          <w:tcPr>
-            <w:tcW w:type="dxa" w:w="425"/>
-            <w:tcMar>
-              <w:top w:w="40" w:type="dxa"/>
-              <w:start w:w="60" w:type="dxa"/>
-              <w:bottom w:w="40" w:type="dxa"/>
-              <w:end w:w="60" w:type="dxa"/>
-            </w:tcMar>
-            <w:shd w:val="clear" w:color="auto" w:fill="A0A0A0"/>
-          </w:tcPr>
-          <w:p>
-            <w:pPr>
-              <w:jc w:val="center"/>
-              <w:spacing w:line="276" w:lineRule="auto" w:after="0"/>
-            </w:pPr>
-            <w:r>
-              <w:rPr>
-                <w:rFonts w:ascii="宋体" w:hAnsi="宋体" w:eastAsia="宋体"/>
-                <w:sz w:val="18"/>
-              </w:rPr>
-              <w:t>█</w:t>
-            </w:r>
-          </w:p>
-        </w:tc>
-        <w:tc>
-          <w:tcPr>
-            <w:tcW w:type="dxa" w:w="425"/>
-            <w:tcMar>
-              <w:top w:w="40" w:type="dxa"/>
-              <w:start w:w="60" w:type="dxa"/>
-              <w:bottom w:w="40" w:type="dxa"/>
-              <w:end w:w="60" w:type="dxa"/>
-            </w:tcMar>
-            <w:shd w:val="clear" w:color="auto" w:fill="A0A0A0"/>
-          </w:tcPr>
-          <w:p>
-            <w:pPr>
-              <w:jc w:val="center"/>
-              <w:spacing w:line="276" w:lineRule="auto" w:after="0"/>
-            </w:pPr>
-            <w:r>
-              <w:rPr>
-                <w:rFonts w:ascii="宋体" w:hAnsi="宋体" w:eastAsia="宋体"/>
-                <w:sz w:val="18"/>
-              </w:rPr>
-              <w:t>█</w:t>
-            </w:r>
-          </w:p>
-        </w:tc>
-        <w:tc>
-          <w:tcPr>
-            <w:tcW w:type="dxa" w:w="425"/>
-            <w:tcMar>
-              <w:top w:w="40" w:type="dxa"/>
-              <w:start w:w="60" w:type="dxa"/>
-              <w:bottom w:w="40" w:type="dxa"/>
-              <w:end w:w="60" w:type="dxa"/>
-            </w:tcMar>
-          </w:tcPr>
-          <w:p>
-            <w:pPr>
-              <w:jc w:val="center"/>
-              <w:spacing w:line="276" w:lineRule="auto" w:after="0"/>
-            </w:pPr>
-            <w:r>
-              <w:rPr>
-                <w:rFonts w:ascii="宋体" w:hAnsi="宋体" w:eastAsia="宋体"/>
-                <w:sz w:val="18"/>
-              </w:rPr>
-            </w:r>
-          </w:p>
-        </w:tc>
-        <w:tc>
-          <w:tcPr>
-            <w:tcW w:type="dxa" w:w="425"/>
-            <w:tcMar>
-              <w:top w:w="40" w:type="dxa"/>
-              <w:start w:w="60" w:type="dxa"/>
-              <w:bottom w:w="40" w:type="dxa"/>
-              <w:end w:w="60" w:type="dxa"/>
-            </w:tcMar>
-          </w:tcPr>
-          <w:p>
-            <w:pPr>
-              <w:jc w:val="center"/>
-              <w:spacing w:line="276" w:lineRule="auto" w:after="0"/>
-            </w:pPr>
-            <w:r>
-              <w:rPr>
-                <w:rFonts w:ascii="宋体" w:hAnsi="宋体" w:eastAsia="宋体"/>
-                <w:sz w:val="18"/>
-              </w:rPr>
-            </w:r>
-          </w:p>
-        </w:tc>
-        <w:tc>
-          <w:tcPr>
-            <w:tcW w:type="dxa" w:w="425"/>
-            <w:tcMar>
-              <w:top w:w="40" w:type="dxa"/>
-              <w:start w:w="60" w:type="dxa"/>
-              <w:bottom w:w="40" w:type="dxa"/>
-              <w:end w:w="60" w:type="dxa"/>
-            </w:tcMar>
-          </w:tcPr>
-          <w:p>
-            <w:pPr>
-              <w:jc w:val="center"/>
-              <w:spacing w:line="276" w:lineRule="auto" w:after="0"/>
-            </w:pPr>
-            <w:r>
-              <w:rPr>
-                <w:rFonts w:ascii="宋体" w:hAnsi="宋体" w:eastAsia="宋体"/>
-                <w:sz w:val="18"/>
-              </w:rPr>
-            </w:r>
-          </w:p>
-        </w:tc>
-        <w:tc>
-          <w:tcPr>
-            <w:tcW w:type="dxa" w:w="425"/>
-            <w:tcMar>
-              <w:top w:w="40" w:type="dxa"/>
-              <w:start w:w="60" w:type="dxa"/>
-              <w:bottom w:w="40" w:type="dxa"/>
-              <w:end w:w="60" w:type="dxa"/>
-            </w:tcMar>
-          </w:tcPr>
-          <w:p>
-            <w:pPr>
-              <w:jc w:val="center"/>
-              <w:spacing w:line="276" w:lineRule="auto" w:after="0"/>
-            </w:pPr>
-            <w:r>
-              <w:rPr>
-                <w:rFonts w:ascii="宋体" w:hAnsi="宋体" w:eastAsia="宋体"/>
-                <w:sz w:val="18"/>
-              </w:rPr>
-            </w:r>
-          </w:p>
-        </w:tc>
-        <w:tc>
-          <w:tcPr>
-            <w:tcW w:type="dxa" w:w="425"/>
-            <w:tcMar>
-              <w:top w:w="40" w:type="dxa"/>
-              <w:start w:w="60" w:type="dxa"/>
-              <w:bottom w:w="40" w:type="dxa"/>
-              <w:end w:w="60" w:type="dxa"/>
-            </w:tcMar>
-          </w:tcPr>
-          <w:p>
-            <w:pPr>
-              <w:jc w:val="center"/>
-              <w:spacing w:line="276" w:lineRule="auto" w:after="0"/>
-            </w:pPr>
-            <w:r>
-              <w:rPr>
-                <w:rFonts w:ascii="宋体" w:hAnsi="宋体" w:eastAsia="宋体"/>
-                <w:sz w:val="18"/>
-              </w:rPr>
-            </w:r>
-          </w:p>
-        </w:tc>
-        <w:tc>
-          <w:tcPr>
-            <w:tcW w:type="dxa" w:w="425"/>
-            <w:tcMar>
-              <w:top w:w="40" w:type="dxa"/>
-              <w:start w:w="60" w:type="dxa"/>
-              <w:bottom w:w="40" w:type="dxa"/>
-              <w:end w:w="60" w:type="dxa"/>
-            </w:tcMar>
-          </w:tcPr>
-          <w:p>
-            <w:pPr>
-              <w:jc w:val="center"/>
-              <w:spacing w:line="276" w:lineRule="auto" w:after="0"/>
-            </w:pPr>
-            <w:r>
-              <w:rPr>
-                <w:rFonts w:ascii="宋体" w:hAnsi="宋体" w:eastAsia="宋体"/>
-                <w:sz w:val="18"/>
-              </w:rPr>
-            </w:r>
-          </w:p>
-        </w:tc>
-        <w:tc>
-          <w:tcPr>
-            <w:tcW w:type="dxa" w:w="425"/>
-            <w:tcMar>
-              <w:top w:w="40" w:type="dxa"/>
-              <w:start w:w="60" w:type="dxa"/>
-              <w:bottom w:w="40" w:type="dxa"/>
-              <w:end w:w="60" w:type="dxa"/>
-            </w:tcMar>
-          </w:tcPr>
-          <w:p>
-            <w:pPr>
-              <w:jc w:val="center"/>
-              <w:spacing w:line="276" w:lineRule="auto" w:after="0"/>
-            </w:pPr>
-            <w:r>
-              <w:rPr>
-                <w:rFonts w:ascii="宋体" w:hAnsi="宋体" w:eastAsia="宋体"/>
-                <w:sz w:val="18"/>
-              </w:rPr>
-            </w:r>
-          </w:p>
-        </w:tc>
-        <w:tc>
-          <w:tcPr>
-            <w:tcW w:type="dxa" w:w="425"/>
-            <w:tcMar>
-              <w:top w:w="40" w:type="dxa"/>
-              <w:start w:w="60" w:type="dxa"/>
-              <w:bottom w:w="40" w:type="dxa"/>
-              <w:end w:w="60" w:type="dxa"/>
-            </w:tcMar>
-          </w:tcPr>
-          <w:p>
-            <w:pPr>
-              <w:jc w:val="center"/>
-              <w:spacing w:line="276" w:lineRule="auto" w:after="0"/>
-            </w:pPr>
-            <w:r>
-              <w:rPr>
-                <w:rFonts w:ascii="宋体" w:hAnsi="宋体" w:eastAsia="宋体"/>
-                <w:sz w:val="18"/>
-              </w:rPr>
-            </w:r>
-          </w:p>
-        </w:tc>
-        <w:tc>
-          <w:tcPr>
-            <w:tcW w:type="dxa" w:w="425"/>
-            <w:tcMar>
-              <w:top w:w="40" w:type="dxa"/>
-              <w:start w:w="60" w:type="dxa"/>
-              <w:bottom w:w="40" w:type="dxa"/>
-              <w:end w:w="60" w:type="dxa"/>
-            </w:tcMar>
-          </w:tcPr>
-          <w:p>
-            <w:pPr>
-              <w:jc w:val="center"/>
-              <w:spacing w:line="276" w:lineRule="auto" w:after="0"/>
-            </w:pPr>
-            <w:r>
-              <w:rPr>
-                <w:rFonts w:ascii="宋体" w:hAnsi="宋体" w:eastAsia="宋体"/>
-                <w:sz w:val="18"/>
-              </w:rPr>
-            </w:r>
-          </w:p>
-        </w:tc>
-      </w:tr>
-      <w:tr>
-        <w:tc>
-          <w:tcPr>
-            <w:tcW w:type="dxa" w:w="3061"/>
-            <w:tcMar>
-              <w:top w:w="40" w:type="dxa"/>
-              <w:start w:w="60" w:type="dxa"/>
-              <w:bottom w:w="40" w:type="dxa"/>
-              <w:end w:w="60" w:type="dxa"/>
-            </w:tcMar>
-          </w:tcPr>
-          <w:p>
-            <w:pPr>
-              <w:spacing w:line="276" w:lineRule="auto" w:after="0"/>
-            </w:pPr>
-            <w:r>
-              <w:rPr>
-                <w:rFonts w:ascii="宋体" w:hAnsi="宋体" w:eastAsia="宋体"/>
-                <w:sz w:val="18"/>
-              </w:rPr>
-              <w:t>M2 Cycle 2/3 训练与基准</w:t>
-            </w:r>
-          </w:p>
-        </w:tc>
-        <w:tc>
-          <w:tcPr>
-            <w:tcW w:type="dxa" w:w="425"/>
-            <w:tcMar>
-              <w:top w:w="40" w:type="dxa"/>
-              <w:start w:w="60" w:type="dxa"/>
-              <w:bottom w:w="40" w:type="dxa"/>
-              <w:end w:w="60" w:type="dxa"/>
-            </w:tcMar>
-          </w:tcPr>
-          <w:p>
-            <w:pPr>
-              <w:jc w:val="center"/>
-              <w:spacing w:line="276" w:lineRule="auto" w:after="0"/>
-            </w:pPr>
-            <w:r>
-              <w:rPr>
-                <w:rFonts w:ascii="宋体" w:hAnsi="宋体" w:eastAsia="宋体"/>
-                <w:sz w:val="18"/>
-              </w:rPr>
-            </w:r>
-          </w:p>
-        </w:tc>
-        <w:tc>
-          <w:tcPr>
-            <w:tcW w:type="dxa" w:w="425"/>
-            <w:tcMar>
-              <w:top w:w="40" w:type="dxa"/>
-              <w:start w:w="60" w:type="dxa"/>
-              <w:bottom w:w="40" w:type="dxa"/>
-              <w:end w:w="60" w:type="dxa"/>
-            </w:tcMar>
-          </w:tcPr>
-          <w:p>
-            <w:pPr>
-              <w:jc w:val="center"/>
-              <w:spacing w:line="276" w:lineRule="auto" w:after="0"/>
-            </w:pPr>
-            <w:r>
-              <w:rPr>
-                <w:rFonts w:ascii="宋体" w:hAnsi="宋体" w:eastAsia="宋体"/>
-                <w:sz w:val="18"/>
-              </w:rPr>
-            </w:r>
-          </w:p>
-        </w:tc>
-        <w:tc>
-          <w:tcPr>
-            <w:tcW w:type="dxa" w:w="425"/>
-            <w:tcMar>
-              <w:top w:w="40" w:type="dxa"/>
-              <w:start w:w="60" w:type="dxa"/>
-              <w:bottom w:w="40" w:type="dxa"/>
-              <w:end w:w="60" w:type="dxa"/>
-            </w:tcMar>
-          </w:tcPr>
-          <w:p>
-            <w:pPr>
-              <w:jc w:val="center"/>
-              <w:spacing w:line="276" w:lineRule="auto" w:after="0"/>
-            </w:pPr>
-            <w:r>
-              <w:rPr>
-                <w:rFonts w:ascii="宋体" w:hAnsi="宋体" w:eastAsia="宋体"/>
-                <w:sz w:val="18"/>
-              </w:rPr>
-            </w:r>
-          </w:p>
-        </w:tc>
-        <w:tc>
-          <w:tcPr>
-            <w:tcW w:type="dxa" w:w="425"/>
-            <w:tcMar>
-              <w:top w:w="40" w:type="dxa"/>
-              <w:start w:w="60" w:type="dxa"/>
-              <w:bottom w:w="40" w:type="dxa"/>
-              <w:end w:w="60" w:type="dxa"/>
-            </w:tcMar>
-            <w:shd w:val="clear" w:color="auto" w:fill="A0A0A0"/>
-          </w:tcPr>
-          <w:p>
-            <w:pPr>
-              <w:jc w:val="center"/>
-              <w:spacing w:line="276" w:lineRule="auto" w:after="0"/>
-            </w:pPr>
-            <w:r>
-              <w:rPr>
-                <w:rFonts w:ascii="宋体" w:hAnsi="宋体" w:eastAsia="宋体"/>
-                <w:sz w:val="18"/>
-              </w:rPr>
-              <w:t>█</w:t>
-            </w:r>
-          </w:p>
-        </w:tc>
-        <w:tc>
-          <w:tcPr>
-            <w:tcW w:type="dxa" w:w="425"/>
-            <w:tcMar>
-              <w:top w:w="40" w:type="dxa"/>
-              <w:start w:w="60" w:type="dxa"/>
-              <w:bottom w:w="40" w:type="dxa"/>
-              <w:end w:w="60" w:type="dxa"/>
-            </w:tcMar>
-            <w:shd w:val="clear" w:color="auto" w:fill="A0A0A0"/>
-          </w:tcPr>
-          <w:p>
-            <w:pPr>
-              <w:jc w:val="center"/>
-              <w:spacing w:line="276" w:lineRule="auto" w:after="0"/>
-            </w:pPr>
-            <w:r>
-              <w:rPr>
-                <w:rFonts w:ascii="宋体" w:hAnsi="宋体" w:eastAsia="宋体"/>
-                <w:sz w:val="18"/>
-              </w:rPr>
-              <w:t>█</w:t>
-            </w:r>
-          </w:p>
-        </w:tc>
-        <w:tc>
-          <w:tcPr>
-            <w:tcW w:type="dxa" w:w="425"/>
-            <w:tcMar>
-              <w:top w:w="40" w:type="dxa"/>
-              <w:start w:w="60" w:type="dxa"/>
-              <w:bottom w:w="40" w:type="dxa"/>
-              <w:end w:w="60" w:type="dxa"/>
-            </w:tcMar>
-            <w:shd w:val="clear" w:color="auto" w:fill="A0A0A0"/>
-          </w:tcPr>
-          <w:p>
-            <w:pPr>
-              <w:jc w:val="center"/>
-              <w:spacing w:line="276" w:lineRule="auto" w:after="0"/>
-            </w:pPr>
-            <w:r>
-              <w:rPr>
-                <w:rFonts w:ascii="宋体" w:hAnsi="宋体" w:eastAsia="宋体"/>
-                <w:sz w:val="18"/>
-              </w:rPr>
-              <w:t>█</w:t>
-            </w:r>
-          </w:p>
-        </w:tc>
-        <w:tc>
-          <w:tcPr>
-            <w:tcW w:type="dxa" w:w="425"/>
-            <w:tcMar>
-              <w:top w:w="40" w:type="dxa"/>
-              <w:start w:w="60" w:type="dxa"/>
-              <w:bottom w:w="40" w:type="dxa"/>
-              <w:end w:w="60" w:type="dxa"/>
-            </w:tcMar>
-            <w:shd w:val="clear" w:color="auto" w:fill="A0A0A0"/>
-          </w:tcPr>
-          <w:p>
-            <w:pPr>
-              <w:jc w:val="center"/>
-              <w:spacing w:line="276" w:lineRule="auto" w:after="0"/>
-            </w:pPr>
-            <w:r>
-              <w:rPr>
-                <w:rFonts w:ascii="宋体" w:hAnsi="宋体" w:eastAsia="宋体"/>
-                <w:sz w:val="18"/>
-              </w:rPr>
-              <w:t>█</w:t>
-            </w:r>
-          </w:p>
-        </w:tc>
-        <w:tc>
-          <w:tcPr>
-            <w:tcW w:type="dxa" w:w="425"/>
-            <w:tcMar>
-              <w:top w:w="40" w:type="dxa"/>
-              <w:start w:w="60" w:type="dxa"/>
-              <w:bottom w:w="40" w:type="dxa"/>
-              <w:end w:w="60" w:type="dxa"/>
-            </w:tcMar>
-          </w:tcPr>
-          <w:p>
-            <w:pPr>
-              <w:jc w:val="center"/>
-              <w:spacing w:line="276" w:lineRule="auto" w:after="0"/>
-            </w:pPr>
-            <w:r>
-              <w:rPr>
-                <w:rFonts w:ascii="宋体" w:hAnsi="宋体" w:eastAsia="宋体"/>
-                <w:sz w:val="18"/>
-              </w:rPr>
-            </w:r>
-          </w:p>
-        </w:tc>
-        <w:tc>
-          <w:tcPr>
-            <w:tcW w:type="dxa" w:w="425"/>
-            <w:tcMar>
-              <w:top w:w="40" w:type="dxa"/>
-              <w:start w:w="60" w:type="dxa"/>
-              <w:bottom w:w="40" w:type="dxa"/>
-              <w:end w:w="60" w:type="dxa"/>
-            </w:tcMar>
-          </w:tcPr>
-          <w:p>
-            <w:pPr>
-              <w:jc w:val="center"/>
-              <w:spacing w:line="276" w:lineRule="auto" w:after="0"/>
-            </w:pPr>
-            <w:r>
-              <w:rPr>
-                <w:rFonts w:ascii="宋体" w:hAnsi="宋体" w:eastAsia="宋体"/>
-                <w:sz w:val="18"/>
-              </w:rPr>
-            </w:r>
-          </w:p>
-        </w:tc>
-        <w:tc>
-          <w:tcPr>
-            <w:tcW w:type="dxa" w:w="425"/>
-            <w:tcMar>
-              <w:top w:w="40" w:type="dxa"/>
-              <w:start w:w="60" w:type="dxa"/>
-              <w:bottom w:w="40" w:type="dxa"/>
-              <w:end w:w="60" w:type="dxa"/>
-            </w:tcMar>
-          </w:tcPr>
-          <w:p>
-            <w:pPr>
-              <w:jc w:val="center"/>
-              <w:spacing w:line="276" w:lineRule="auto" w:after="0"/>
-            </w:pPr>
-            <w:r>
-              <w:rPr>
-                <w:rFonts w:ascii="宋体" w:hAnsi="宋体" w:eastAsia="宋体"/>
-                <w:sz w:val="18"/>
-              </w:rPr>
-            </w:r>
-          </w:p>
-        </w:tc>
-        <w:tc>
-          <w:tcPr>
-            <w:tcW w:type="dxa" w:w="425"/>
-            <w:tcMar>
-              <w:top w:w="40" w:type="dxa"/>
-              <w:start w:w="60" w:type="dxa"/>
-              <w:bottom w:w="40" w:type="dxa"/>
-              <w:end w:w="60" w:type="dxa"/>
-            </w:tcMar>
-          </w:tcPr>
-          <w:p>
-            <w:pPr>
-              <w:jc w:val="center"/>
-              <w:spacing w:line="276" w:lineRule="auto" w:after="0"/>
-            </w:pPr>
-            <w:r>
-              <w:rPr>
-                <w:rFonts w:ascii="宋体" w:hAnsi="宋体" w:eastAsia="宋体"/>
-                <w:sz w:val="18"/>
-              </w:rPr>
-            </w:r>
-          </w:p>
-        </w:tc>
-        <w:tc>
-          <w:tcPr>
-            <w:tcW w:type="dxa" w:w="425"/>
-            <w:tcMar>
-              <w:top w:w="40" w:type="dxa"/>
-              <w:start w:w="60" w:type="dxa"/>
-              <w:bottom w:w="40" w:type="dxa"/>
-              <w:end w:w="60" w:type="dxa"/>
-            </w:tcMar>
-          </w:tcPr>
-          <w:p>
-            <w:pPr>
-              <w:jc w:val="center"/>
-              <w:spacing w:line="276" w:lineRule="auto" w:after="0"/>
-            </w:pPr>
-            <w:r>
-              <w:rPr>
-                <w:rFonts w:ascii="宋体" w:hAnsi="宋体" w:eastAsia="宋体"/>
-                <w:sz w:val="18"/>
-              </w:rPr>
-            </w:r>
-          </w:p>
-        </w:tc>
-      </w:tr>
-      <w:tr>
-        <w:tc>
-          <w:tcPr>
-            <w:tcW w:type="dxa" w:w="3061"/>
-            <w:tcMar>
-              <w:top w:w="40" w:type="dxa"/>
-              <w:start w:w="60" w:type="dxa"/>
-              <w:bottom w:w="40" w:type="dxa"/>
-              <w:end w:w="60" w:type="dxa"/>
-            </w:tcMar>
-          </w:tcPr>
-          <w:p>
-            <w:pPr>
-              <w:spacing w:line="276" w:lineRule="auto" w:after="0"/>
-            </w:pPr>
-            <w:r>
-              <w:rPr>
-                <w:rFonts w:ascii="宋体" w:hAnsi="宋体" w:eastAsia="宋体"/>
-                <w:sz w:val="18"/>
-              </w:rPr>
-              <w:t>M3 Bootstrap 与系统集成</w:t>
-            </w:r>
-          </w:p>
-        </w:tc>
-        <w:tc>
-          <w:tcPr>
-            <w:tcW w:type="dxa" w:w="425"/>
-            <w:tcMar>
-              <w:top w:w="40" w:type="dxa"/>
-              <w:start w:w="60" w:type="dxa"/>
-              <w:bottom w:w="40" w:type="dxa"/>
-              <w:end w:w="60" w:type="dxa"/>
-            </w:tcMar>
-          </w:tcPr>
-          <w:p>
-            <w:pPr>
-              <w:jc w:val="center"/>
-              <w:spacing w:line="276" w:lineRule="auto" w:after="0"/>
-            </w:pPr>
-            <w:r>
-              <w:rPr>
-                <w:rFonts w:ascii="宋体" w:hAnsi="宋体" w:eastAsia="宋体"/>
-                <w:sz w:val="18"/>
-              </w:rPr>
-            </w:r>
-          </w:p>
-        </w:tc>
-        <w:tc>
-          <w:tcPr>
-            <w:tcW w:type="dxa" w:w="425"/>
-            <w:tcMar>
-              <w:top w:w="40" w:type="dxa"/>
-              <w:start w:w="60" w:type="dxa"/>
-              <w:bottom w:w="40" w:type="dxa"/>
-              <w:end w:w="60" w:type="dxa"/>
-            </w:tcMar>
-          </w:tcPr>
-          <w:p>
-            <w:pPr>
-              <w:jc w:val="center"/>
-              <w:spacing w:line="276" w:lineRule="auto" w:after="0"/>
-            </w:pPr>
-            <w:r>
-              <w:rPr>
-                <w:rFonts w:ascii="宋体" w:hAnsi="宋体" w:eastAsia="宋体"/>
-                <w:sz w:val="18"/>
-              </w:rPr>
-            </w:r>
-          </w:p>
-        </w:tc>
-        <w:tc>
-          <w:tcPr>
-            <w:tcW w:type="dxa" w:w="425"/>
-            <w:tcMar>
-              <w:top w:w="40" w:type="dxa"/>
-              <w:start w:w="60" w:type="dxa"/>
-              <w:bottom w:w="40" w:type="dxa"/>
-              <w:end w:w="60" w:type="dxa"/>
-            </w:tcMar>
-          </w:tcPr>
-          <w:p>
-            <w:pPr>
-              <w:jc w:val="center"/>
-              <w:spacing w:line="276" w:lineRule="auto" w:after="0"/>
-            </w:pPr>
-            <w:r>
-              <w:rPr>
-                <w:rFonts w:ascii="宋体" w:hAnsi="宋体" w:eastAsia="宋体"/>
-                <w:sz w:val="18"/>
-              </w:rPr>
-            </w:r>
-          </w:p>
-        </w:tc>
-        <w:tc>
-          <w:tcPr>
-            <w:tcW w:type="dxa" w:w="425"/>
-            <w:tcMar>
-              <w:top w:w="40" w:type="dxa"/>
-              <w:start w:w="60" w:type="dxa"/>
-              <w:bottom w:w="40" w:type="dxa"/>
-              <w:end w:w="60" w:type="dxa"/>
-            </w:tcMar>
-          </w:tcPr>
-          <w:p>
-            <w:pPr>
-              <w:jc w:val="center"/>
-              <w:spacing w:line="276" w:lineRule="auto" w:after="0"/>
-            </w:pPr>
-            <w:r>
-              <w:rPr>
-                <w:rFonts w:ascii="宋体" w:hAnsi="宋体" w:eastAsia="宋体"/>
-                <w:sz w:val="18"/>
-              </w:rPr>
-            </w:r>
-          </w:p>
-        </w:tc>
-        <w:tc>
-          <w:tcPr>
-            <w:tcW w:type="dxa" w:w="425"/>
-            <w:tcMar>
-              <w:top w:w="40" w:type="dxa"/>
-              <w:start w:w="60" w:type="dxa"/>
-              <w:bottom w:w="40" w:type="dxa"/>
-              <w:end w:w="60" w:type="dxa"/>
-            </w:tcMar>
-          </w:tcPr>
-          <w:p>
-            <w:pPr>
-              <w:jc w:val="center"/>
-              <w:spacing w:line="276" w:lineRule="auto" w:after="0"/>
-            </w:pPr>
-            <w:r>
-              <w:rPr>
-                <w:rFonts w:ascii="宋体" w:hAnsi="宋体" w:eastAsia="宋体"/>
-                <w:sz w:val="18"/>
-              </w:rPr>
-            </w:r>
-          </w:p>
-        </w:tc>
-        <w:tc>
-          <w:tcPr>
-            <w:tcW w:type="dxa" w:w="425"/>
-            <w:tcMar>
-              <w:top w:w="40" w:type="dxa"/>
-              <w:start w:w="60" w:type="dxa"/>
-              <w:bottom w:w="40" w:type="dxa"/>
-              <w:end w:w="60" w:type="dxa"/>
-            </w:tcMar>
-          </w:tcPr>
-          <w:p>
-            <w:pPr>
-              <w:jc w:val="center"/>
-              <w:spacing w:line="276" w:lineRule="auto" w:after="0"/>
-            </w:pPr>
-            <w:r>
-              <w:rPr>
-                <w:rFonts w:ascii="宋体" w:hAnsi="宋体" w:eastAsia="宋体"/>
-                <w:sz w:val="18"/>
-              </w:rPr>
-            </w:r>
-          </w:p>
-        </w:tc>
-        <w:tc>
-          <w:tcPr>
-            <w:tcW w:type="dxa" w:w="425"/>
-            <w:tcMar>
-              <w:top w:w="40" w:type="dxa"/>
-              <w:start w:w="60" w:type="dxa"/>
-              <w:bottom w:w="40" w:type="dxa"/>
-              <w:end w:w="60" w:type="dxa"/>
-            </w:tcMar>
-          </w:tcPr>
-          <w:p>
-            <w:pPr>
-              <w:jc w:val="center"/>
-              <w:spacing w:line="276" w:lineRule="auto" w:after="0"/>
-            </w:pPr>
-            <w:r>
-              <w:rPr>
-                <w:rFonts w:ascii="宋体" w:hAnsi="宋体" w:eastAsia="宋体"/>
-                <w:sz w:val="18"/>
-              </w:rPr>
-            </w:r>
-          </w:p>
-        </w:tc>
-        <w:tc>
-          <w:tcPr>
-            <w:tcW w:type="dxa" w:w="425"/>
-            <w:tcMar>
-              <w:top w:w="40" w:type="dxa"/>
-              <w:start w:w="60" w:type="dxa"/>
-              <w:bottom w:w="40" w:type="dxa"/>
-              <w:end w:w="60" w:type="dxa"/>
-            </w:tcMar>
-            <w:shd w:val="clear" w:color="auto" w:fill="A0A0A0"/>
-          </w:tcPr>
-          <w:p>
-            <w:pPr>
-              <w:jc w:val="center"/>
-              <w:spacing w:line="276" w:lineRule="auto" w:after="0"/>
-            </w:pPr>
-            <w:r>
-              <w:rPr>
-                <w:rFonts w:ascii="宋体" w:hAnsi="宋体" w:eastAsia="宋体"/>
-                <w:sz w:val="18"/>
-              </w:rPr>
-              <w:t>█</w:t>
-            </w:r>
-          </w:p>
-        </w:tc>
-        <w:tc>
-          <w:tcPr>
-            <w:tcW w:type="dxa" w:w="425"/>
-            <w:tcMar>
-              <w:top w:w="40" w:type="dxa"/>
-              <w:start w:w="60" w:type="dxa"/>
-              <w:bottom w:w="40" w:type="dxa"/>
-              <w:end w:w="60" w:type="dxa"/>
-            </w:tcMar>
-            <w:shd w:val="clear" w:color="auto" w:fill="A0A0A0"/>
-          </w:tcPr>
-          <w:p>
-            <w:pPr>
-              <w:jc w:val="center"/>
-              <w:spacing w:line="276" w:lineRule="auto" w:after="0"/>
-            </w:pPr>
-            <w:r>
-              <w:rPr>
-                <w:rFonts w:ascii="宋体" w:hAnsi="宋体" w:eastAsia="宋体"/>
-                <w:sz w:val="18"/>
-              </w:rPr>
-              <w:t>█</w:t>
-            </w:r>
-          </w:p>
-        </w:tc>
-        <w:tc>
-          <w:tcPr>
-            <w:tcW w:type="dxa" w:w="425"/>
-            <w:tcMar>
-              <w:top w:w="40" w:type="dxa"/>
-              <w:start w:w="60" w:type="dxa"/>
-              <w:bottom w:w="40" w:type="dxa"/>
-              <w:end w:w="60" w:type="dxa"/>
-            </w:tcMar>
-          </w:tcPr>
-          <w:p>
-            <w:pPr>
-              <w:jc w:val="center"/>
-              <w:spacing w:line="276" w:lineRule="auto" w:after="0"/>
-            </w:pPr>
-            <w:r>
-              <w:rPr>
-                <w:rFonts w:ascii="宋体" w:hAnsi="宋体" w:eastAsia="宋体"/>
-                <w:sz w:val="18"/>
-              </w:rPr>
-            </w:r>
-          </w:p>
-        </w:tc>
-        <w:tc>
-          <w:tcPr>
-            <w:tcW w:type="dxa" w:w="425"/>
-            <w:tcMar>
-              <w:top w:w="40" w:type="dxa"/>
-              <w:start w:w="60" w:type="dxa"/>
-              <w:bottom w:w="40" w:type="dxa"/>
-              <w:end w:w="60" w:type="dxa"/>
-            </w:tcMar>
-          </w:tcPr>
-          <w:p>
-            <w:pPr>
-              <w:jc w:val="center"/>
-              <w:spacing w:line="276" w:lineRule="auto" w:after="0"/>
-            </w:pPr>
-            <w:r>
-              <w:rPr>
-                <w:rFonts w:ascii="宋体" w:hAnsi="宋体" w:eastAsia="宋体"/>
-                <w:sz w:val="18"/>
-              </w:rPr>
-            </w:r>
-          </w:p>
-        </w:tc>
-        <w:tc>
-          <w:tcPr>
-            <w:tcW w:type="dxa" w:w="425"/>
-            <w:tcMar>
-              <w:top w:w="40" w:type="dxa"/>
-              <w:start w:w="60" w:type="dxa"/>
-              <w:bottom w:w="40" w:type="dxa"/>
-              <w:end w:w="60" w:type="dxa"/>
-            </w:tcMar>
-          </w:tcPr>
-          <w:p>
-            <w:pPr>
-              <w:jc w:val="center"/>
-              <w:spacing w:line="276" w:lineRule="auto" w:after="0"/>
-            </w:pPr>
-            <w:r>
-              <w:rPr>
-                <w:rFonts w:ascii="宋体" w:hAnsi="宋体" w:eastAsia="宋体"/>
-                <w:sz w:val="18"/>
-              </w:rPr>
-            </w:r>
-          </w:p>
-        </w:tc>
-      </w:tr>
-      <w:tr>
-        <w:tc>
-          <w:tcPr>
-            <w:tcW w:type="dxa" w:w="3061"/>
-            <w:tcMar>
-              <w:top w:w="40" w:type="dxa"/>
-              <w:start w:w="60" w:type="dxa"/>
-              <w:bottom w:w="40" w:type="dxa"/>
-              <w:end w:w="60" w:type="dxa"/>
-            </w:tcMar>
-          </w:tcPr>
-          <w:p>
-            <w:pPr>
-              <w:spacing w:line="276" w:lineRule="auto" w:after="0"/>
-            </w:pPr>
-            <w:r>
-              <w:rPr>
-                <w:rFonts w:ascii="宋体" w:hAnsi="宋体" w:eastAsia="宋体"/>
-                <w:sz w:val="18"/>
-              </w:rPr>
-              <w:t>M4 评估与最终交付</w:t>
-            </w:r>
-          </w:p>
-        </w:tc>
-        <w:tc>
-          <w:tcPr>
-            <w:tcW w:type="dxa" w:w="425"/>
-            <w:tcMar>
-              <w:top w:w="40" w:type="dxa"/>
-              <w:start w:w="60" w:type="dxa"/>
-              <w:bottom w:w="40" w:type="dxa"/>
-              <w:end w:w="60" w:type="dxa"/>
-            </w:tcMar>
-          </w:tcPr>
-          <w:p>
-            <w:pPr>
-              <w:jc w:val="center"/>
-              <w:spacing w:line="276" w:lineRule="auto" w:after="0"/>
-            </w:pPr>
-            <w:r>
-              <w:rPr>
-                <w:rFonts w:ascii="宋体" w:hAnsi="宋体" w:eastAsia="宋体"/>
-                <w:sz w:val="18"/>
-              </w:rPr>
-            </w:r>
-          </w:p>
-        </w:tc>
-        <w:tc>
-          <w:tcPr>
-            <w:tcW w:type="dxa" w:w="425"/>
-            <w:tcMar>
-              <w:top w:w="40" w:type="dxa"/>
-              <w:start w:w="60" w:type="dxa"/>
-              <w:bottom w:w="40" w:type="dxa"/>
-              <w:end w:w="60" w:type="dxa"/>
-            </w:tcMar>
-          </w:tcPr>
-          <w:p>
-            <w:pPr>
-              <w:jc w:val="center"/>
-              <w:spacing w:line="276" w:lineRule="auto" w:after="0"/>
-            </w:pPr>
-            <w:r>
-              <w:rPr>
-                <w:rFonts w:ascii="宋体" w:hAnsi="宋体" w:eastAsia="宋体"/>
-                <w:sz w:val="18"/>
-              </w:rPr>
-            </w:r>
-          </w:p>
-        </w:tc>
-        <w:tc>
-          <w:tcPr>
-            <w:tcW w:type="dxa" w:w="425"/>
-            <w:tcMar>
-              <w:top w:w="40" w:type="dxa"/>
-              <w:start w:w="60" w:type="dxa"/>
-              <w:bottom w:w="40" w:type="dxa"/>
-              <w:end w:w="60" w:type="dxa"/>
-            </w:tcMar>
-          </w:tcPr>
-          <w:p>
-            <w:pPr>
-              <w:jc w:val="center"/>
-              <w:spacing w:line="276" w:lineRule="auto" w:after="0"/>
-            </w:pPr>
-            <w:r>
-              <w:rPr>
-                <w:rFonts w:ascii="宋体" w:hAnsi="宋体" w:eastAsia="宋体"/>
-                <w:sz w:val="18"/>
-              </w:rPr>
-            </w:r>
-          </w:p>
-        </w:tc>
-        <w:tc>
-          <w:tcPr>
-            <w:tcW w:type="dxa" w:w="425"/>
-            <w:tcMar>
-              <w:top w:w="40" w:type="dxa"/>
-              <w:start w:w="60" w:type="dxa"/>
-              <w:bottom w:w="40" w:type="dxa"/>
-              <w:end w:w="60" w:type="dxa"/>
-            </w:tcMar>
-          </w:tcPr>
-          <w:p>
-            <w:pPr>
-              <w:jc w:val="center"/>
-              <w:spacing w:line="276" w:lineRule="auto" w:after="0"/>
-            </w:pPr>
-            <w:r>
-              <w:rPr>
-                <w:rFonts w:ascii="宋体" w:hAnsi="宋体" w:eastAsia="宋体"/>
-                <w:sz w:val="18"/>
-              </w:rPr>
-            </w:r>
-          </w:p>
-        </w:tc>
-        <w:tc>
-          <w:tcPr>
-            <w:tcW w:type="dxa" w:w="425"/>
-            <w:tcMar>
-              <w:top w:w="40" w:type="dxa"/>
-              <w:start w:w="60" w:type="dxa"/>
-              <w:bottom w:w="40" w:type="dxa"/>
-              <w:end w:w="60" w:type="dxa"/>
-            </w:tcMar>
-          </w:tcPr>
-          <w:p>
-            <w:pPr>
-              <w:jc w:val="center"/>
-              <w:spacing w:line="276" w:lineRule="auto" w:after="0"/>
-            </w:pPr>
-            <w:r>
-              <w:rPr>
-                <w:rFonts w:ascii="宋体" w:hAnsi="宋体" w:eastAsia="宋体"/>
-                <w:sz w:val="18"/>
-              </w:rPr>
-            </w:r>
-          </w:p>
-        </w:tc>
-        <w:tc>
-          <w:tcPr>
-            <w:tcW w:type="dxa" w:w="425"/>
-            <w:tcMar>
-              <w:top w:w="40" w:type="dxa"/>
-              <w:start w:w="60" w:type="dxa"/>
-              <w:bottom w:w="40" w:type="dxa"/>
-              <w:end w:w="60" w:type="dxa"/>
-            </w:tcMar>
-          </w:tcPr>
-          <w:p>
-            <w:pPr>
-              <w:jc w:val="center"/>
-              <w:spacing w:line="276" w:lineRule="auto" w:after="0"/>
-            </w:pPr>
-            <w:r>
-              <w:rPr>
-                <w:rFonts w:ascii="宋体" w:hAnsi="宋体" w:eastAsia="宋体"/>
-                <w:sz w:val="18"/>
-              </w:rPr>
-            </w:r>
-          </w:p>
-        </w:tc>
-        <w:tc>
-          <w:tcPr>
-            <w:tcW w:type="dxa" w:w="425"/>
-            <w:tcMar>
-              <w:top w:w="40" w:type="dxa"/>
-              <w:start w:w="60" w:type="dxa"/>
-              <w:bottom w:w="40" w:type="dxa"/>
-              <w:end w:w="60" w:type="dxa"/>
-            </w:tcMar>
-          </w:tcPr>
-          <w:p>
-            <w:pPr>
-              <w:jc w:val="center"/>
-              <w:spacing w:line="276" w:lineRule="auto" w:after="0"/>
-            </w:pPr>
-            <w:r>
-              <w:rPr>
-                <w:rFonts w:ascii="宋体" w:hAnsi="宋体" w:eastAsia="宋体"/>
-                <w:sz w:val="18"/>
-              </w:rPr>
-            </w:r>
-          </w:p>
-        </w:tc>
-        <w:tc>
-          <w:tcPr>
-            <w:tcW w:type="dxa" w:w="425"/>
-            <w:tcMar>
-              <w:top w:w="40" w:type="dxa"/>
-              <w:start w:w="60" w:type="dxa"/>
-              <w:bottom w:w="40" w:type="dxa"/>
-              <w:end w:w="60" w:type="dxa"/>
-            </w:tcMar>
-          </w:tcPr>
-          <w:p>
-            <w:pPr>
-              <w:jc w:val="center"/>
-              <w:spacing w:line="276" w:lineRule="auto" w:after="0"/>
-            </w:pPr>
-            <w:r>
-              <w:rPr>
-                <w:rFonts w:ascii="宋体" w:hAnsi="宋体" w:eastAsia="宋体"/>
-                <w:sz w:val="18"/>
-              </w:rPr>
-            </w:r>
-          </w:p>
-        </w:tc>
-        <w:tc>
-          <w:tcPr>
-            <w:tcW w:type="dxa" w:w="425"/>
-            <w:tcMar>
-              <w:top w:w="40" w:type="dxa"/>
-              <w:start w:w="60" w:type="dxa"/>
-              <w:bottom w:w="40" w:type="dxa"/>
-              <w:end w:w="60" w:type="dxa"/>
-            </w:tcMar>
-          </w:tcPr>
-          <w:p>
-            <w:pPr>
-              <w:jc w:val="center"/>
-              <w:spacing w:line="276" w:lineRule="auto" w:after="0"/>
-            </w:pPr>
-            <w:r>
-              <w:rPr>
-                <w:rFonts w:ascii="宋体" w:hAnsi="宋体" w:eastAsia="宋体"/>
-                <w:sz w:val="18"/>
-              </w:rPr>
-            </w:r>
-          </w:p>
-        </w:tc>
-        <w:tc>
-          <w:tcPr>
-            <w:tcW w:type="dxa" w:w="425"/>
-            <w:tcMar>
-              <w:top w:w="40" w:type="dxa"/>
-              <w:start w:w="60" w:type="dxa"/>
-              <w:bottom w:w="40" w:type="dxa"/>
-              <w:end w:w="60" w:type="dxa"/>
-            </w:tcMar>
-            <w:shd w:val="clear" w:color="auto" w:fill="A0A0A0"/>
-          </w:tcPr>
-          <w:p>
-            <w:pPr>
-              <w:jc w:val="center"/>
-              <w:spacing w:line="276" w:lineRule="auto" w:after="0"/>
-            </w:pPr>
-            <w:r>
-              <w:rPr>
-                <w:rFonts w:ascii="宋体" w:hAnsi="宋体" w:eastAsia="宋体"/>
-                <w:sz w:val="18"/>
-              </w:rPr>
-              <w:t>█</w:t>
-            </w:r>
-          </w:p>
-        </w:tc>
-        <w:tc>
-          <w:tcPr>
-            <w:tcW w:type="dxa" w:w="425"/>
-            <w:tcMar>
-              <w:top w:w="40" w:type="dxa"/>
-              <w:start w:w="60" w:type="dxa"/>
-              <w:bottom w:w="40" w:type="dxa"/>
-              <w:end w:w="60" w:type="dxa"/>
-            </w:tcMar>
-            <w:shd w:val="clear" w:color="auto" w:fill="A0A0A0"/>
-          </w:tcPr>
-          <w:p>
-            <w:pPr>
-              <w:jc w:val="center"/>
-              <w:spacing w:line="276" w:lineRule="auto" w:after="0"/>
-            </w:pPr>
-            <w:r>
-              <w:rPr>
-                <w:rFonts w:ascii="宋体" w:hAnsi="宋体" w:eastAsia="宋体"/>
-                <w:sz w:val="18"/>
-              </w:rPr>
-              <w:t>█</w:t>
-            </w:r>
-          </w:p>
-        </w:tc>
-        <w:tc>
-          <w:tcPr>
-            <w:tcW w:type="dxa" w:w="425"/>
-            <w:tcMar>
-              <w:top w:w="40" w:type="dxa"/>
-              <w:start w:w="60" w:type="dxa"/>
-              <w:bottom w:w="40" w:type="dxa"/>
-              <w:end w:w="60" w:type="dxa"/>
-            </w:tcMar>
-            <w:shd w:val="clear" w:color="auto" w:fill="A0A0A0"/>
-          </w:tcPr>
-          <w:p>
-            <w:pPr>
-              <w:jc w:val="center"/>
-              <w:spacing w:line="276" w:lineRule="auto" w:after="0"/>
-            </w:pPr>
-            <w:r>
-              <w:rPr>
-                <w:rFonts w:ascii="宋体" w:hAnsi="宋体" w:eastAsia="宋体"/>
-                <w:sz w:val="18"/>
-              </w:rPr>
-              <w:t>█</w:t>
-            </w:r>
-          </w:p>
-        </w:tc>
-      </w:tr>
-    </w:tbl>
     <w:p>
       <w:pPr>
         <w:spacing w:line="276" w:lineRule="auto" w:after="120"/>

</xml_diff>